<commit_message>
Odstrani <!-- TVOJA ... --> predloge iz diploma_combined.docx
40 praznih komentar paragrafov odstranjenih, 18 paragrafov
očiščenih (ohranjena vsebina za komentarjem).

Co-Authored-By: Claude Sonnet 4.6 <noreply@anthropic.com>
</commit_message>
<xml_diff>
--- a/diplomska/diploma_combined.docx
+++ b/diplomska/diploma_combined.docx
@@ -6050,7 +6050,7 @@
           <w:i w:val="0"/>
           <w:sz w:val="24"/>
         </w:rPr>
-        <w:t>&lt;!-- TVOJA ZAHVALA: --&gt; Zahvaljujem se očetu Primožu, soustanovitelju Hisofta. Zahvaljujem se sodelavcem na Hisoftu. Zahvaljujem se šoli za vso znanje in spodbude.</w:t>
+        <w:t>Zahvaljujem se očetu Primožu, soustanovitelju Hisofta. Zahvaljujem se sodelavcem na Hisoftu. Zahvaljujem se šoli za vso znanje in spodbude.</w:t>
       </w:r>
     </w:p>
     <w:p>
@@ -6197,21 +6197,6 @@
       <w:r>
         <w:rPr>
           <w:rFonts w:ascii="Times New Roman" w:hAnsi="Times New Roman"/>
-          <w:b w:val="0"/>
-          <w:i w:val="0"/>
-          <w:sz w:val="24"/>
-        </w:rPr>
-        <w:t>&lt;!-- TVOJ DODATEN ODSTAVEK ZA IZVLEČEK: --&gt;</w:t>
-      </w:r>
-    </w:p>
-    <w:p>
-      <w:pPr>
-        <w:spacing w:before="0" w:after="120" w:lineRule="auto" w:line="360"/>
-        <w:jc w:val="both"/>
-      </w:pPr>
-      <w:r>
-        <w:rPr>
-          <w:rFonts w:ascii="Times New Roman" w:hAnsi="Times New Roman"/>
           <w:b/>
           <w:i w:val="0"/>
           <w:sz w:val="24"/>
@@ -6312,21 +6297,6 @@
           <w:sz w:val="22"/>
         </w:rPr>
         <w:t xml:space="preserve"> Prevedi lasten odstavek iz slovenskega izvlečka v angleščino. Ni treba biti popoln — povej bistvo v 3–4 stavkih.</w:t>
-      </w:r>
-    </w:p>
-    <w:p>
-      <w:pPr>
-        <w:spacing w:before="0" w:after="120" w:lineRule="auto" w:line="360"/>
-        <w:jc w:val="both"/>
-      </w:pPr>
-      <w:r>
-        <w:rPr>
-          <w:rFonts w:ascii="Times New Roman" w:hAnsi="Times New Roman"/>
-          <w:b w:val="0"/>
-          <w:i w:val="0"/>
-          <w:sz w:val="24"/>
-        </w:rPr>
-        <w:t>&lt;!-- TVOJ ABSTRACT: --&gt;</w:t>
       </w:r>
     </w:p>
     <w:p>
@@ -7220,21 +7190,6 @@
     </w:p>
     <w:p>
       <w:pPr>
-        <w:spacing w:before="0" w:after="120" w:lineRule="auto" w:line="360"/>
-        <w:jc w:val="both"/>
-      </w:pPr>
-      <w:r>
-        <w:rPr>
-          <w:rFonts w:ascii="Times New Roman" w:hAnsi="Times New Roman"/>
-          <w:b w:val="0"/>
-          <w:i w:val="0"/>
-          <w:sz w:val="24"/>
-        </w:rPr>
-        <w:t>&lt;!-- TVOJE DODANE KRATICE: --&gt;</w:t>
-      </w:r>
-    </w:p>
-    <w:p>
-      <w:pPr>
         <w:pBdr>
           <w:bottom w:val="single" w:sz="6" w:space="1" w:color="AAAAAA"/>
         </w:pBdr>
@@ -7515,21 +7470,6 @@
           <w:i w:val="0"/>
           <w:sz w:val="24"/>
         </w:rPr>
-        <w:t>&lt;!-- TVOJA OSEBNA MOTIVACIJA: --&gt;</w:t>
-      </w:r>
-    </w:p>
-    <w:p>
-      <w:pPr>
-        <w:spacing w:before="0" w:after="120" w:lineRule="auto" w:line="360"/>
-        <w:jc w:val="both"/>
-      </w:pPr>
-      <w:r>
-        <w:rPr>
-          <w:rFonts w:ascii="Times New Roman" w:hAnsi="Times New Roman"/>
-          <w:b w:val="0"/>
-          <w:i w:val="0"/>
-          <w:sz w:val="24"/>
-        </w:rPr>
         <w:t xml:space="preserve">Sodobni trg poslovne programske opreme jasno kaže smer razvoja. Vodilni konkurenti na slovenskem trgu — </w:t>
       </w:r>
       <w:r>
@@ -8081,21 +8021,6 @@
           <w:i w:val="0"/>
           <w:sz w:val="24"/>
         </w:rPr>
-        <w:t>&lt;!-- TVOJA ANALIZA KONKURENCE: --&gt;</w:t>
-      </w:r>
-    </w:p>
-    <w:p>
-      <w:pPr>
-        <w:spacing w:before="0" w:after="120" w:lineRule="auto" w:line="360"/>
-        <w:jc w:val="both"/>
-      </w:pPr>
-      <w:r>
-        <w:rPr>
-          <w:rFonts w:ascii="Times New Roman" w:hAnsi="Times New Roman"/>
-          <w:b w:val="0"/>
-          <w:i w:val="0"/>
-          <w:sz w:val="24"/>
-        </w:rPr>
         <w:t>Obstoječi namizni sistem Hisoft verzija 2020 prinaša konkretne operativne izzive: ročno nameščanje posodobitev pri vsaki stranki posebej, odsotnost spletnega dostopa, pomanjkanje REST API vmesnikov za integracijo z zunanjimi sistemi ter preobremenjeno tehnično podporo zaradi napak pri ročnem vnosu podatkov.</w:t>
       </w:r>
     </w:p>
@@ -8155,21 +8080,6 @@
           <w:i w:val="0"/>
           <w:sz w:val="24"/>
         </w:rPr>
-        <w:t>&lt;!-- TVOJ OPIS REALNEGA SCENARIJA: --&gt;</w:t>
-      </w:r>
-    </w:p>
-    <w:p>
-      <w:pPr>
-        <w:spacing w:before="0" w:after="120" w:lineRule="auto" w:line="360"/>
-        <w:jc w:val="both"/>
-      </w:pPr>
-      <w:r>
-        <w:rPr>
-          <w:rFonts w:ascii="Times New Roman" w:hAnsi="Times New Roman"/>
-          <w:b w:val="0"/>
-          <w:i w:val="0"/>
-          <w:sz w:val="24"/>
-        </w:rPr>
         <w:t>Treba je rocno posodabljati parametre v bazi in testirati nove obracune</w:t>
       </w:r>
     </w:p>
@@ -8359,21 +8269,6 @@
           <w:i w:val="0"/>
           <w:sz w:val="24"/>
         </w:rPr>
-        <w:t>&lt;!-- TVOJ DODATEN CILJ: --&gt;</w:t>
-      </w:r>
-    </w:p>
-    <w:p>
-      <w:pPr>
-        <w:spacing w:before="0" w:after="120" w:lineRule="auto" w:line="360"/>
-        <w:jc w:val="both"/>
-      </w:pPr>
-      <w:r>
-        <w:rPr>
-          <w:rFonts w:ascii="Times New Roman" w:hAnsi="Times New Roman"/>
-          <w:b w:val="0"/>
-          <w:i w:val="0"/>
-          <w:sz w:val="24"/>
-        </w:rPr>
         <w:t>Enostavna uproaba za uporabnike, izgradnja ekosistema za deljenje znanja, novic, podpora z APIji za izvoz , prenos, uvoz opdatkov in osnova za AI agentic okolja v prihodnosti ki bodo samostojno objavljala, preverjala, ustvarjala informacije.</w:t>
       </w:r>
     </w:p>
@@ -8520,21 +8415,6 @@
           <w:i w:val="0"/>
           <w:sz w:val="24"/>
         </w:rPr>
-        <w:t>&lt;!-- TVOJA REFLEKSIJA O HIPOTEZAH: --&gt;</w:t>
-      </w:r>
-    </w:p>
-    <w:p>
-      <w:pPr>
-        <w:spacing w:before="0" w:after="120" w:lineRule="auto" w:line="360"/>
-        <w:jc w:val="both"/>
-      </w:pPr>
-      <w:r>
-        <w:rPr>
-          <w:rFonts w:ascii="Times New Roman" w:hAnsi="Times New Roman"/>
-          <w:b w:val="0"/>
-          <w:i w:val="0"/>
-          <w:sz w:val="24"/>
-        </w:rPr>
         <w:t>Vsaka hipoteza predstavlja nek izziv na nekem delu saasa - backend, baza ali frontend. Moj cilj je razsiriti znanje in najbolje je tako da naslovim probleme in posicem resitve z tehnicno izobljsavo z nagnjenjnu k popolnosti.</w:t>
       </w:r>
     </w:p>
@@ -8653,7 +8533,7 @@
           <w:i w:val="0"/>
           <w:sz w:val="24"/>
         </w:rPr>
-        <w:t>&lt;!-- TVOJA RAZLAGA TRISTOPENJSKE ARHITEKTURE: --&gt; Trije sloji ločijo skrbi: Angular skrbi le za prikaz in interakcijo z uporabnikom (računovodjo), Node.js zaledje izvaja poslovno logiko (npr. obračun plač, RBAC), podatkovni sloj pa hrani in ščiti podatke (RLS v MS SQL, Redis za predpomnjenje). Če bi vso to logiko strpal v eno datoteko, bi bila koda težko berljiva in nemogoča za vzdrževanje — sprememba v enem delu (npr. spremenjena dohodninska lestvica) bi tvegala, da nehote pokvariš prikaz ali dostop do podatkov. Prav tako ne bi mogel neodvisno testirati ali skalirati posameznih delov (npr. samo backend ob večji obremenitvi obračuna).</w:t>
+        <w:t>Trije sloji ločijo skrbi: Angular skrbi le za prikaz in interakcijo z uporabnikom (računovodjo), Node.js zaledje izvaja poslovno logiko (npr. obračun plač, RBAC), podatkovni sloj pa hrani in ščiti podatke (RLS v MS SQL, Redis za predpomnjenje). Če bi vso to logiko strpal v eno datoteko, bi bila koda težko berljiva in nemogoča za vzdrževanje — sprememba v enem delu (npr. spremenjena dohodninska lestvica) bi tvegala, da nehote pokvariš prikaz ali dostop do podatkov. Prav tako ne bi mogel neodvisno testirati ali skalirati posameznih delov (npr. samo backend ob večji obremenitvi obračuna).</w:t>
       </w:r>
     </w:p>
     <w:p>
@@ -8867,21 +8747,6 @@
           <w:i w:val="0"/>
           <w:sz w:val="24"/>
         </w:rPr>
-        <w:t>&lt;!-- TVOJA UTEMELJITEV ANGULAR: --&gt;</w:t>
-      </w:r>
-    </w:p>
-    <w:p>
-      <w:pPr>
-        <w:spacing w:before="0" w:after="120" w:lineRule="auto" w:line="360"/>
-        <w:jc w:val="both"/>
-      </w:pPr>
-      <w:r>
-        <w:rPr>
-          <w:rFonts w:ascii="Times New Roman" w:hAnsi="Times New Roman"/>
-          <w:b w:val="0"/>
-          <w:i w:val="0"/>
-          <w:sz w:val="24"/>
-        </w:rPr>
         <w:t>Angular sem izbral, ker se ga v podjetju Hisoft trenutno uvaja kot standardno rešitev za frontend, kar zagotavlja dolgoročno podporo in konsistentnost z ostalimi projekti. Poleg tega Angular uporablja TypeScript, kar pomeni, da lahko z zalednim delom (Node.js/TypeScript) delim tipe podatkov in zmanjšam napake pri komunikaciji med sloji.</w:t>
       </w:r>
     </w:p>
@@ -8956,7 +8821,7 @@
           <w:i w:val="0"/>
           <w:sz w:val="24"/>
         </w:rPr>
-        <w:t>&lt;!-- TVOJA ANALOGIJA ZA LAZY LOADING: --&gt; Lazy loading je kot restavracija, ki ne pripravi vseh jedi na meniju vnaprej, temveč skuha vsako jed šele, ko jo gost dejansko naroči — tako se čas in viri porabijo le za tisto, kar je res potrebno. Podobno spletna aplikacija ob prvem zagonu naloži le tisto, kar uporabnik takoj vidi (npr. prijavni obrazec), ostale module (npr. poročila ali nastavitve) pa prenese šele, ko uporabnik dejansko klikne nanje.</w:t>
+        <w:t>Lazy loading je kot restavracija, ki ne pripravi vseh jedi na meniju vnaprej, temveč skuha vsako jed šele, ko jo gost dejansko naroči — tako se čas in viri porabijo le za tisto, kar je res potrebno. Podobno spletna aplikacija ob prvem zagonu naloži le tisto, kar uporabnik takoj vidi (npr. prijavni obrazec), ostale module (npr. poročila ali nastavitve) pa prenese šele, ko uporabnik dejansko klikne nanje.</w:t>
       </w:r>
     </w:p>
     <w:p>
@@ -9192,21 +9057,6 @@
           <w:i w:val="0"/>
           <w:sz w:val="24"/>
         </w:rPr>
-        <w:t>&lt;!-- TVOJA ANALOGIJA ZA EVENT LOOP BLOKADO: --&gt;</w:t>
-      </w:r>
-    </w:p>
-    <w:p>
-      <w:pPr>
-        <w:spacing w:before="0" w:after="120" w:lineRule="auto" w:line="360"/>
-        <w:jc w:val="both"/>
-      </w:pPr>
-      <w:r>
-        <w:rPr>
-          <w:rFonts w:ascii="Times New Roman" w:hAnsi="Times New Roman"/>
-          <w:b w:val="0"/>
-          <w:i w:val="0"/>
-          <w:sz w:val="24"/>
-        </w:rPr>
         <w:t>Node.js deluje kot restavracija z enim samim natakarjem, ki streže vsem mizam hkrati — dokler je zaposlen z eno nalogo, ne more sprejeti nobene druge. Če ta natakar (Express funkcija) sinhrono izračuna plače za 500 zaposlenih v eni sami zahtevi, "blokira" celotno strežbo, dokler izračun ne konča — noben drug gost (uporabnik) v tem času ne more niti oddati naročila niti dobiti odgovora, čeprav njegova zahteva morda sploh ni povezana z obračunom plač. To pomeni, da bi en dolg izračun začasno "zamrznil" celotno aplikacijo za vse uporabnike, ne le za tistega, ki je obračun sprožil. Rešitev je asinhrono procesiranje (npr. vrsta opravil), kjer natakar nalogo odda v kuhinjo in medtem streže naprej, obračun pa se izvede v ozadju.</w:t>
       </w:r>
     </w:p>
@@ -9251,7 +9101,7 @@
           <w:i w:val="0"/>
           <w:sz w:val="24"/>
         </w:rPr>
-        <w:t>&lt;!-- TVOJA RAZLAGA ASYNCLOCALSTORAGE: --&gt; Če bi tenant_id ročno podajal kot parameter, bi ga moral dodati v vsako funkcijo v celotni klicni verigi — od kontrolerja do repozitorija — tudi v funkcije, ki ga sicer sploh ne potrebujejo za svojo logiko, ampak ga le "prenašajo naprej". To poveča tveganje za napako (nekdo pozabi parameter podati ali ga po pomoti zamenja z drugim tenant_id), kar je pri finančnih podatkih nesprejemljivo. AsyncLocalStorage namesto tega vzdržuje kontekst avtomatično skozi celoten asinhroni tok zahtevka, tako da je tenant_id vedno na voljo brez eksplicitnega podajanja, hkrati pa je vsak zahtevek izoliran od drugih.</w:t>
+        <w:t>Če bi tenant_id ročno podajal kot parameter, bi ga moral dodati v vsako funkcijo v celotni klicni verigi — od kontrolerja do repozitorija — tudi v funkcije, ki ga sicer sploh ne potrebujejo za svojo logiko, ampak ga le "prenašajo naprej". To poveča tveganje za napako (nekdo pozabi parameter podati ali ga po pomoti zamenja z drugim tenant_id), kar je pri finančnih podatkih nesprejemljivo. AsyncLocalStorage namesto tega vzdržuje kontekst avtomatično skozi celoten asinhroni tok zahtevka, tako da je tenant_id vedno na voljo brez eksplicitnega podajanja, hkrati pa je vsak zahtevek izoliran od drugih.</w:t>
       </w:r>
     </w:p>
     <w:p>
@@ -9445,7 +9295,7 @@
           <w:i w:val="0"/>
           <w:sz w:val="24"/>
         </w:rPr>
-        <w:t>&lt;!-- TVOJA ANALOGIJA ZA RLS: --&gt; RLS deluje kot hotel, kjer ima vsak gost ključno kartico, ki odpre le vrata njegove lastne sobe — ne glede na to, po katerem hodniku hodi ali katera vrata poskuša odpreti, kartica preprosto ne bo delovala na sobah drugih gostov. Podobno RLS na nivoju baze samodejno "prilagodi ključ" vsaki poizvedbi glede na SESSION_CONTEXT (identifikator najemnika), tako da tudi če aplikacijska koda po nesreči pošlje poizvedbo brez filtra po podjetju, baza sama vrne le vrstice, ki pripadajo temu najemniku. Gost tako sploh ne ve, da druge sobe (podatki drugih podjetij) obstajajo — zanj je, kot da je v hotelu sam.</w:t>
+        <w:t>RLS deluje kot hotel, kjer ima vsak gost ključno kartico, ki odpre le vrata njegove lastne sobe — ne glede na to, po katerem hodniku hodi ali katera vrata poskuša odpreti, kartica preprosto ne bo delovala na sobah drugih gostov. Podobno RLS na nivoju baze samodejno "prilagodi ključ" vsaki poizvedbi glede na SESSION_CONTEXT (identifikator najemnika), tako da tudi če aplikacijska koda po nesreči pošlje poizvedbo brez filtra po podjetju, baza sama vrne le vrstice, ki pripadajo temu najemniku. Gost tako sploh ne ve, da druge sobe (podatki drugih podjetij) obstajajo — zanj je, kot da je v hotelu sam.</w:t>
       </w:r>
     </w:p>
     <w:p>
@@ -9489,7 +9339,7 @@
           <w:i w:val="0"/>
           <w:sz w:val="24"/>
         </w:rPr>
-        <w:t>&lt;!-- TVOJA UTEMELJITEV TEMPORALNIH TABEL: --&gt; Revizijska sled je pri obračunu plač zakonsko nujna, saj mora biti ob morebitnem inšpekcijskem nadzoru ali sporu z zaposlenim mogoče dokazati, kakšna je bila plača na določen datum in kdo jo je spremenil. Poslovno je koristna tudi zato, ker omogoča odkrivanje napak ali zlorab (npr. nepooblaščena sprememba zneska) in njihovo popravljanje brez izgube podatka o prvotnem stanju.</w:t>
+        <w:t>Revizijska sled je pri obračunu plač zakonsko nujna, saj mora biti ob morebitnem inšpekcijskem nadzoru ali sporu z zaposlenim mogoče dokazati, kakšna je bila plača na določen datum in kdo jo je spremenil. Poslovno je koristna tudi zato, ker omogoča odkrivanje napak ali zlorab (npr. nepooblaščena sprememba zneska) in njihovo popravljanje brez izgube podatka o prvotnem stanju.</w:t>
       </w:r>
     </w:p>
     <w:p>
@@ -9599,7 +9449,7 @@
           <w:i w:val="0"/>
           <w:sz w:val="24"/>
         </w:rPr>
-        <w:t>&lt;!-- TVOJ OPIS ASINHRONEGA POTEKA: --&gt; Najprej računovodja v Angular vmesniku klikne gumb "Izvedi obračun" za celotno podjetje, kar sproži HTTP zahtevo proti zalednemu delu. Nato Express controller sprejme zahtevo, jo validira in namesto da bi obračun izvedel takoj, opravilo doda v BullMQ vrsto (shranjeno v Redisu) ter uporabniku takoj vrne odgovor HTTP 202 Accepted, skupaj z identifikatorjem opravila. Medtem Angular uporabniku prikaže sporočilo tipa "Obračun se izvaja" oz. indikator napredka, ne da bi vmesnik "obvisel". Vzporedno ločen BullMQ delavec (worker), ki teče neodvisno od Express strežnika, prevzame opravilo iz vrste in izvede dejanski izračun plač za vse zaposlene. Ko delavec zaključi obračun, rezultat zapiše v bazo, status opravila pa posodobi na "končano". Na koncu Angular vmesnik (npr. s periodičnim preverjanjem statusa ali WebSocket obvestilom) zazna, da je opravilo končano, in računovodji prikaže rezultat oz. možnost prenosa poročila.</w:t>
+        <w:t>Najprej računovodja v Angular vmesniku klikne gumb "Izvedi obračun" za celotno podjetje, kar sproži HTTP zahtevo proti zalednemu delu. Nato Express controller sprejme zahtevo, jo validira in namesto da bi obračun izvedel takoj, opravilo doda v BullMQ vrsto (shranjeno v Redisu) ter uporabniku takoj vrne odgovor HTTP 202 Accepted, skupaj z identifikatorjem opravila. Medtem Angular uporabniku prikaže sporočilo tipa "Obračun se izvaja" oz. indikator napredka, ne da bi vmesnik "obvisel". Vzporedno ločen BullMQ delavec (worker), ki teče neodvisno od Express strežnika, prevzame opravilo iz vrste in izvede dejanski izračun plač za vse zaposlene. Ko delavec zaključi obračun, rezultat zapiše v bazo, status opravila pa posodobi na "končano". Na koncu Angular vmesnik (npr. s periodičnim preverjanjem statusa ali WebSocket obvestilom) zazna, da je opravilo končano, in računovodji prikaže rezultat oz. možnost prenosa poročila.</w:t>
       </w:r>
     </w:p>
     <w:p>
@@ -9682,7 +9532,7 @@
           <w:i w:val="0"/>
           <w:sz w:val="24"/>
         </w:rPr>
-        <w:t>&lt;!-- TVOJA UTEMELJITEV ANALIZE: --&gt; Analiza obstoječega sistema je nujna, ker razkrije, katera poslovna logika, pravila in posebni primeri (npr. specifični izračuni dodatkov) so v starem sistemu implicitno vgrajeni, pa nikjer dokumentirani — brez tega razumevanja bi nov sistem lahko izgubil funkcionalnost, ki jo uporabniki dejansko potrebujejo. Če to fazo preskočiš, tvegaš, da boš v novi rešitvi ponovil iste arhitekturne napake ali pa v produkciji odkril manjkajočo funkcionalnost šele, ko bo prepozno in drago za popravek.</w:t>
+        <w:t>Analiza obstoječega sistema je nujna, ker razkrije, katera poslovna logika, pravila in posebni primeri (npr. specifični izračuni dodatkov) so v starem sistemu implicitno vgrajeni, pa nikjer dokumentirani — brez tega razumevanja bi nov sistem lahko izgubil funkcionalnost, ki jo uporabniki dejansko potrebujejo. Če to fazo preskočiš, tvegaš, da boš v novi rešitvi ponovil iste arhitekturne napake ali pa v produkciji odkril manjkajočo funkcionalnost šele, ko bo prepozno in drago za popravek.</w:t>
       </w:r>
     </w:p>
     <w:p>
@@ -10171,21 +10021,6 @@
     </w:p>
     <w:p>
       <w:pPr>
-        <w:spacing w:before="0" w:after="120" w:lineRule="auto" w:line="360"/>
-        <w:jc w:val="both"/>
-      </w:pPr>
-      <w:r>
-        <w:rPr>
-          <w:rFonts w:ascii="Times New Roman" w:hAnsi="Times New Roman"/>
-          <w:b w:val="0"/>
-          <w:i w:val="0"/>
-          <w:sz w:val="24"/>
-        </w:rPr>
-        <w:t>&lt;!-- TVOJA OPAZKA O DELAVCI.TXT: --&gt;</w:t>
-      </w:r>
-    </w:p>
-    <w:p>
-      <w:pPr>
         <w:spacing w:before="80" w:after="80" w:lineRule="auto" w:line="360"/>
         <w:ind w:left="567" w:right="567"/>
         <w:jc w:val="left"/>
@@ -10225,21 +10060,6 @@
           <w:i w:val="0"/>
           <w:sz w:val="24"/>
         </w:rPr>
-        <w:t>&lt;!-- TVOJA RAZLAGA O NVARCHAR ZA TRR: --&gt;</w:t>
-      </w:r>
-    </w:p>
-    <w:p>
-      <w:pPr>
-        <w:spacing w:before="0" w:after="120" w:lineRule="auto" w:line="360"/>
-        <w:jc w:val="both"/>
-      </w:pPr>
-      <w:r>
-        <w:rPr>
-          <w:rFonts w:ascii="Times New Roman" w:hAnsi="Times New Roman"/>
-          <w:b w:val="0"/>
-          <w:i w:val="0"/>
-          <w:sz w:val="24"/>
-        </w:rPr>
         <w:t xml:space="preserve">Obseg izvorne kode starega sistema sega do </w:t>
       </w:r>
       <w:r>
@@ -10310,21 +10130,6 @@
     </w:p>
     <w:p>
       <w:pPr>
-        <w:spacing w:before="0" w:after="120" w:lineRule="auto" w:line="360"/>
-        <w:jc w:val="both"/>
-      </w:pPr>
-      <w:r>
-        <w:rPr>
-          <w:rFonts w:ascii="Times New Roman" w:hAnsi="Times New Roman"/>
-          <w:b w:val="0"/>
-          <w:i w:val="0"/>
-          <w:sz w:val="24"/>
-        </w:rPr>
-        <w:t>&lt;!-- TVOJA REFLEKSIJA O VZDRŽEVALNOSTI PLACE.VB: --&gt;</w:t>
-      </w:r>
-    </w:p>
-    <w:p>
-      <w:pPr>
         <w:spacing w:before="200" w:after="80" w:lineRule="auto" w:line="288"/>
         <w:jc w:val="left"/>
       </w:pPr>
@@ -10420,21 +10225,6 @@
     </w:p>
     <w:p>
       <w:pPr>
-        <w:spacing w:before="0" w:after="120" w:lineRule="auto" w:line="360"/>
-        <w:jc w:val="both"/>
-      </w:pPr>
-      <w:r>
-        <w:rPr>
-          <w:rFonts w:ascii="Times New Roman" w:hAnsi="Times New Roman"/>
-          <w:b w:val="0"/>
-          <w:i w:val="0"/>
-          <w:sz w:val="24"/>
-        </w:rPr>
-        <w:t>&lt;!-- TVOJ OPIS VARNOSTNEGA TVEGANJA: --&gt;</w:t>
-      </w:r>
-    </w:p>
-    <w:p>
-      <w:pPr>
         <w:spacing w:before="80" w:after="80" w:lineRule="auto" w:line="360"/>
         <w:ind w:left="567" w:right="567"/>
         <w:jc w:val="left"/>
@@ -10474,7 +10264,7 @@
           <w:i w:val="0"/>
           <w:sz w:val="24"/>
         </w:rPr>
-        <w:t>&lt;!-- TVOJA RAZLAGA OMEJITEV APLIKACIJSKE IZOLACIJE: --&gt; Osnutek najslabšega scenarija:</w:t>
+        <w:t>Osnutek najslabšega scenarija:</w:t>
       </w:r>
     </w:p>
     <w:p>
@@ -10601,21 +10391,6 @@
     </w:p>
     <w:p>
       <w:pPr>
-        <w:spacing w:before="0" w:after="120" w:lineRule="auto" w:line="360"/>
-        <w:jc w:val="both"/>
-      </w:pPr>
-      <w:r>
-        <w:rPr>
-          <w:rFonts w:ascii="Times New Roman" w:hAnsi="Times New Roman"/>
-          <w:b w:val="0"/>
-          <w:i w:val="0"/>
-          <w:sz w:val="24"/>
-        </w:rPr>
-        <w:t>&lt;!-- TVOJA ANALOGIJA ZA EVENT LOOP: --&gt;</w:t>
-      </w:r>
-    </w:p>
-    <w:p>
-      <w:pPr>
         <w:spacing w:before="80" w:after="80" w:lineRule="auto" w:line="360"/>
         <w:ind w:left="567" w:right="567"/>
         <w:jc w:val="left"/>
@@ -10655,7 +10430,7 @@
           <w:i w:val="0"/>
           <w:sz w:val="24"/>
         </w:rPr>
-        <w:t>&lt;!-- TVOJA RAZLAGA RAZLIKE DESKTOP VS SAAS: --&gt; Osnutek analogije za Event Loop:</w:t>
+        <w:t>Osnutek analogije za Event Loop:</w:t>
       </w:r>
     </w:p>
     <w:p>
@@ -10801,7 +10576,7 @@
           <w:i w:val="0"/>
           <w:sz w:val="24"/>
         </w:rPr>
-        <w:t>&lt;!-- TVOJA RDEČA NIT MED ANALIZO IN ZASNOVO: --&gt; Pri zasnovi nove rešitve so me vodili trije problemi, ki sem jih identificiral pri analizi obstoječega sistema: podatkovni kaos v razpršenih tabelah brez konsistentnih relacij, popolna odsotnost izolacije med najemniki ter sinhrona blokada niti pri masovnih izračunih. Prvi problem sem naslovil z normalizacijo podatkovnega modela do tretje normalne oblike, kar odpravlja podvajanje in nekonsistentnost podatkov. Drugega sem rešil z uvedbo Row-Level Security neposredno na nivoju baze podatkov, tako da izolacija ni odvisna od discipline razvijalca, temveč je zagotovljena sistemsko. Tretjega sem naslovil z asinhrono arhitekturo (BullMQ delavci), ki dolge izračune premakne izven glavne niti Express strežnika, tako da ostane aplikacija odzivna za vse uporabnike. Te tri odločitve tako neposredno izhajajo iz konkretnih pomanjkljivosti, ugotovljenih v poglavju 3, kar zagotavlja, da zasnova ni le teoretična, temveč ciljno rešuje realne probleme starega sistema.</w:t>
+        <w:t>Pri zasnovi nove rešitve so me vodili trije problemi, ki sem jih identificiral pri analizi obstoječega sistema: podatkovni kaos v razpršenih tabelah brez konsistentnih relacij, popolna odsotnost izolacije med najemniki ter sinhrona blokada niti pri masovnih izračunih. Prvi problem sem naslovil z normalizacijo podatkovnega modela do tretje normalne oblike, kar odpravlja podvajanje in nekonsistentnost podatkov. Drugega sem rešil z uvedbo Row-Level Security neposredno na nivoju baze podatkov, tako da izolacija ni odvisna od discipline razvijalca, temveč je zagotovljena sistemsko. Tretjega sem naslovil z asinhrono arhitekturo (BullMQ delavci), ki dolge izračune premakne izven glavne niti Express strežnika, tako da ostane aplikacija odzivna za vse uporabnike. Te tri odločitve tako neposredno izhajajo iz konkretnih pomanjkljivosti, ugotovljenih v poglavju 3, kar zagotavlja, da zasnova ni le teoretična, temveč ciljno rešuje realne probleme starega sistema.</w:t>
       </w:r>
     </w:p>
     <w:p>
@@ -11917,21 +11692,6 @@
           <w:i w:val="0"/>
           <w:sz w:val="24"/>
         </w:rPr>
-        <w:t>&lt;!-- TVOJA RAZLAGA PAYROLL_PARAMS: --&gt;</w:t>
-      </w:r>
-    </w:p>
-    <w:p>
-      <w:pPr>
-        <w:spacing w:before="0" w:after="120" w:lineRule="auto" w:line="360"/>
-        <w:jc w:val="both"/>
-      </w:pPr>
-      <w:r>
-        <w:rPr>
-          <w:rFonts w:ascii="Times New Roman" w:hAnsi="Times New Roman"/>
-          <w:b w:val="0"/>
-          <w:i w:val="0"/>
-          <w:sz w:val="24"/>
-        </w:rPr>
         <w:t>Osnutek razlage payroll_params:</w:t>
       </w:r>
     </w:p>
@@ -12045,7 +11805,7 @@
           <w:i w:val="0"/>
           <w:sz w:val="24"/>
         </w:rPr>
-        <w:t>&lt;!-- TVOJA UTEMELJITEV PRAVILNIH PODATKOVNIH TIPOV: --&gt; Osnutek utemeljitve pravilnih podatkovnih tipov:</w:t>
+        <w:t>Osnutek utemeljitve pravilnih podatkovnih tipov:</w:t>
       </w:r>
     </w:p>
     <w:p>
@@ -12311,21 +12071,6 @@
           <w:i w:val="0"/>
           <w:sz w:val="24"/>
         </w:rPr>
-        <w:t>&lt;!-- TVOJA RAZLAGA SESSION_CONTEXT: --&gt;</w:t>
-      </w:r>
-    </w:p>
-    <w:p>
-      <w:pPr>
-        <w:spacing w:before="0" w:after="120" w:lineRule="auto" w:line="360"/>
-        <w:jc w:val="both"/>
-      </w:pPr>
-      <w:r>
-        <w:rPr>
-          <w:rFonts w:ascii="Times New Roman" w:hAnsi="Times New Roman"/>
-          <w:b w:val="0"/>
-          <w:i w:val="0"/>
-          <w:sz w:val="24"/>
-        </w:rPr>
         <w:t>Osnutek razlage SESSION_CONTEXT:</w:t>
       </w:r>
     </w:p>
@@ -12385,7 +12130,7 @@
           <w:i w:val="0"/>
           <w:sz w:val="24"/>
         </w:rPr>
-        <w:t>&lt;!-- TVOJ VARNOSTNI SCENARIJ: --&gt; tek varnostnega scenarija:</w:t>
+        <w:t>tek varnostnega scenarija:</w:t>
       </w:r>
     </w:p>
     <w:p>
@@ -12550,21 +12295,6 @@
           <w:sz w:val="22"/>
         </w:rPr>
         <w:t xml:space="preserve"> Navedi konkreten primer, zakaj je revizijska sled nujna pri plačah. Kaj se zgodi, ko zaposleni trdi, da je bila njegova plača marca 2025 višja, kot kaže izpisek? Kako temporalna tabela pomaga pri reševanju tega spora? (3–4 stavki)</w:t>
-      </w:r>
-    </w:p>
-    <w:p>
-      <w:pPr>
-        <w:spacing w:before="0" w:after="120" w:lineRule="auto" w:line="360"/>
-        <w:jc w:val="both"/>
-      </w:pPr>
-      <w:r>
-        <w:rPr>
-          <w:rFonts w:ascii="Times New Roman" w:hAnsi="Times New Roman"/>
-          <w:b w:val="0"/>
-          <w:i w:val="0"/>
-          <w:sz w:val="24"/>
-        </w:rPr>
-        <w:t>&lt;!-- TVOJ PRIMER REVIZIJSKE SLEDI: --&gt;</w:t>
       </w:r>
     </w:p>
     <w:p>
@@ -13266,21 +12996,6 @@
     </w:p>
     <w:p>
       <w:pPr>
-        <w:spacing w:before="0" w:after="120" w:lineRule="auto" w:line="360"/>
-        <w:jc w:val="both"/>
-      </w:pPr>
-      <w:r>
-        <w:rPr>
-          <w:rFonts w:ascii="Times New Roman" w:hAnsi="Times New Roman"/>
-          <w:b w:val="0"/>
-          <w:i w:val="0"/>
-          <w:sz w:val="24"/>
-        </w:rPr>
-        <w:t>&lt;!-- TVOJA RAZLAGA API VERSIONIRANJA: --&gt;</w:t>
-      </w:r>
-    </w:p>
-    <w:p>
-      <w:pPr>
         <w:spacing w:before="80" w:after="80" w:lineRule="auto" w:line="360"/>
         <w:ind w:left="567" w:right="567"/>
         <w:jc w:val="left"/>
@@ -13342,21 +13057,6 @@
           <w:sz w:val="22"/>
         </w:rPr>
         <w:t xml:space="preserve"> (preveri status) v kontekstu asinhronega modela — zakaj sta dve ločeni poti in ne ena? (2–3 stavki)</w:t>
-      </w:r>
-    </w:p>
-    <w:p>
-      <w:pPr>
-        <w:spacing w:before="0" w:after="120" w:lineRule="auto" w:line="360"/>
-        <w:jc w:val="both"/>
-      </w:pPr>
-      <w:r>
-        <w:rPr>
-          <w:rFonts w:ascii="Times New Roman" w:hAnsi="Times New Roman"/>
-          <w:b w:val="0"/>
-          <w:i w:val="0"/>
-          <w:sz w:val="24"/>
-        </w:rPr>
-        <w:t>&lt;!-- TVOJA RAZLAGA ASINHRONEGA API VZORCA: --&gt;</w:t>
       </w:r>
     </w:p>
     <w:p>
@@ -14164,21 +13864,6 @@
     </w:p>
     <w:p>
       <w:pPr>
-        <w:spacing w:before="0" w:after="120" w:lineRule="auto" w:line="360"/>
-        <w:jc w:val="both"/>
-      </w:pPr>
-      <w:r>
-        <w:rPr>
-          <w:rFonts w:ascii="Times New Roman" w:hAnsi="Times New Roman"/>
-          <w:b w:val="0"/>
-          <w:i w:val="0"/>
-          <w:sz w:val="24"/>
-        </w:rPr>
-        <w:t>&lt;!-- TVOJ ROČNI IZRAČUN IN REFLEKSIJA: --&gt;</w:t>
-      </w:r>
-    </w:p>
-    <w:p>
-      <w:pPr>
         <w:spacing w:before="80" w:after="80" w:lineRule="auto" w:line="360"/>
         <w:ind w:left="567" w:right="567"/>
         <w:jc w:val="left"/>
@@ -14251,15 +13936,6 @@
         <w:rPr>
           <w:rFonts w:ascii="Times New Roman" w:hAnsi="Times New Roman"/>
           <w:b w:val="0"/>
-          <w:i w:val="0"/>
-          <w:sz w:val="24"/>
-        </w:rPr>
-        <w:t xml:space="preserve">&lt;!-- TVOJA RAZLAGA FLOATING POINT PROBLEMA: --&gt; </w:t>
-      </w:r>
-      <w:r>
-        <w:rPr>
-          <w:rFonts w:ascii="Times New Roman" w:hAnsi="Times New Roman"/>
-          <w:b/>
           <w:i w:val="0"/>
           <w:sz w:val="24"/>
         </w:rPr>
@@ -14732,21 +14408,6 @@
           <w:i w:val="0"/>
           <w:sz w:val="24"/>
         </w:rPr>
-        <w:t>&lt;!-- TVOJA RAZLAGA CLIENT-SIDE VALIDACIJE: --&gt;</w:t>
-      </w:r>
-    </w:p>
-    <w:p>
-      <w:pPr>
-        <w:spacing w:before="0" w:after="120" w:lineRule="auto" w:line="360"/>
-        <w:jc w:val="both"/>
-      </w:pPr>
-      <w:r>
-        <w:rPr>
-          <w:rFonts w:ascii="Times New Roman" w:hAnsi="Times New Roman"/>
-          <w:b w:val="0"/>
-          <w:i w:val="0"/>
-          <w:sz w:val="24"/>
-        </w:rPr>
         <w:t>Osnutek razlage client-side validacije:</w:t>
       </w:r>
     </w:p>
@@ -14803,15 +14464,6 @@
         <w:rPr>
           <w:rFonts w:ascii="Times New Roman" w:hAnsi="Times New Roman"/>
           <w:b w:val="0"/>
-          <w:i w:val="0"/>
-          <w:sz w:val="24"/>
-        </w:rPr>
-        <w:t xml:space="preserve">&lt;!-- TVOJ OPIS ČAROVNIKA ZA ZAPOSLENEGA: --&gt; </w:t>
-      </w:r>
-      <w:r>
-        <w:rPr>
-          <w:rFonts w:ascii="Times New Roman" w:hAnsi="Times New Roman"/>
-          <w:b/>
           <w:i w:val="0"/>
           <w:sz w:val="24"/>
         </w:rPr>
@@ -15152,7 +14804,7 @@
           <w:i w:val="0"/>
           <w:sz w:val="24"/>
         </w:rPr>
-        <w:t>&lt;!-- TVOJA RAZLAGA JWT VELJAVNOSTI: --&gt;</w:t>
+        <w:t>Osnutek razlage JWT veljavnosti:</w:t>
       </w:r>
     </w:p>
     <w:p>
@@ -15167,37 +14819,7 @@
           <w:i w:val="0"/>
           <w:sz w:val="24"/>
         </w:rPr>
-        <w:t>Osnutek razlage JWT veljavnosti:</w:t>
-      </w:r>
-    </w:p>
-    <w:p>
-      <w:pPr>
-        <w:spacing w:before="0" w:after="120" w:lineRule="auto" w:line="360"/>
-        <w:jc w:val="both"/>
-      </w:pPr>
-      <w:r>
-        <w:rPr>
-          <w:rFonts w:ascii="Times New Roman" w:hAnsi="Times New Roman"/>
-          <w:b w:val="0"/>
-          <w:i w:val="0"/>
-          <w:sz w:val="24"/>
-        </w:rPr>
         <w:t>JWT žeton ima veljavnost 8 ur, ker to približno ustreza enemu delovnemu dnevu — dovolj dolgo, da se računovodja ne prijavlja v sistem vsakih nekaj minut, hkrati pa dovolj kratko, da ukraden ali uhajan žeton ne ostane uporaben za napadalca v nedogled (kot bi se zgodilo pri 30-dnevni veljavnosti). Če žeton poteče med delom, uporabnika sistem preusmeri nazaj na prijavo, kar sicer prekine delovni tok, a to je zavesten kompromis: raje sprejmemo manjšo nevšečnost občasne ponovne prijave kot pa tveganje, da bi ukraden žeton omogočal dostop do plačilnih podatkov cel mesec. Za daljše seje bi lahko dodatno uvedli refresh token mehanizem, ki bi uporabniku omogočil podaljšanje seje brez ponovnega vnosa gesla, a ohranil kratko veljavnost dostopnega žetona.</w:t>
-      </w:r>
-    </w:p>
-    <w:p>
-      <w:pPr>
-        <w:spacing w:before="0" w:after="120" w:lineRule="auto" w:line="360"/>
-        <w:jc w:val="both"/>
-      </w:pPr>
-      <w:r>
-        <w:rPr>
-          <w:rFonts w:ascii="Times New Roman" w:hAnsi="Times New Roman"/>
-          <w:b w:val="0"/>
-          <w:i w:val="0"/>
-          <w:sz w:val="24"/>
-        </w:rPr>
-        <w:t>&lt;!-- TVOJA RAZLAGA BCRYPT: --&gt;</w:t>
       </w:r>
     </w:p>
     <w:p>
@@ -15422,21 +15044,6 @@
       <w:r>
         <w:rPr>
           <w:rFonts w:ascii="Times New Roman" w:hAnsi="Times New Roman"/>
-          <w:b w:val="0"/>
-          <w:i w:val="0"/>
-          <w:sz w:val="24"/>
-        </w:rPr>
-        <w:t>&lt;!-- TVOJA RAZLAGA XML STANDARDOV: --&gt;</w:t>
-      </w:r>
-    </w:p>
-    <w:p>
-      <w:pPr>
-        <w:spacing w:before="0" w:after="120" w:lineRule="auto" w:line="360"/>
-        <w:jc w:val="both"/>
-      </w:pPr>
-      <w:r>
-        <w:rPr>
-          <w:rFonts w:ascii="Times New Roman" w:hAnsi="Times New Roman"/>
           <w:b/>
           <w:i w:val="0"/>
           <w:sz w:val="24"/>
@@ -15496,21 +15103,6 @@
       <w:r>
         <w:rPr>
           <w:rFonts w:ascii="Times New Roman" w:hAnsi="Times New Roman"/>
-          <w:b w:val="0"/>
-          <w:i w:val="0"/>
-          <w:sz w:val="24"/>
-        </w:rPr>
-        <w:t>&lt;!-- TVOJA RAZLAGA DIGITALNEGA PODPISA: --&gt;</w:t>
-      </w:r>
-    </w:p>
-    <w:p>
-      <w:pPr>
-        <w:spacing w:before="0" w:after="120" w:lineRule="auto" w:line="360"/>
-        <w:jc w:val="both"/>
-      </w:pPr>
-      <w:r>
-        <w:rPr>
-          <w:rFonts w:ascii="Times New Roman" w:hAnsi="Times New Roman"/>
           <w:b/>
           <w:i w:val="0"/>
           <w:sz w:val="24"/>
@@ -15771,43 +15363,7 @@
           <w:i w:val="0"/>
           <w:sz w:val="24"/>
         </w:rPr>
-        <w:t xml:space="preserve">&lt;!-- TVOJI PRIMERI UMAZANIH PODATKOV: --&gt; </w:t>
-      </w:r>
-      <w:r>
-        <w:rPr>
-          <w:rFonts w:ascii="Times New Roman" w:hAnsi="Times New Roman"/>
-          <w:b/>
-          <w:i w:val="0"/>
-          <w:sz w:val="24"/>
-        </w:rPr>
-        <w:t>Napotek:</w:t>
-      </w:r>
-      <w:r>
-        <w:rPr>
-          <w:rFonts w:ascii="Times New Roman" w:hAnsi="Times New Roman"/>
-          <w:b w:val="0"/>
-          <w:i w:val="0"/>
-          <w:sz w:val="24"/>
-        </w:rPr>
-        <w:t xml:space="preserve"> Nimam dostopa do </w:t>
-      </w:r>
-      <w:r>
-        <w:rPr>
-          <w:rFonts w:ascii="Courier New" w:hAnsi="Courier New"/>
-          <w:b w:val="0"/>
-          <w:i w:val="0"/>
-          <w:sz w:val="22"/>
-        </w:rPr>
-        <w:t>DELAVCI.txt</w:t>
-      </w:r>
-      <w:r>
-        <w:rPr>
-          <w:rFonts w:ascii="Times New Roman" w:hAnsi="Times New Roman"/>
-          <w:b w:val="0"/>
-          <w:i w:val="0"/>
-          <w:sz w:val="24"/>
-        </w:rPr>
-        <w:t>, ki ga navodila omenjajo, zato spodaj podajam tipične primere umazanih podatkov, značilne za stare namizne sisteme — preveri jih ob dejanski datoteki in po potrebi zamenjaj s konkretnimi primeri, ki jih dejansko najdeš.</w:t>
+        <w:t>Napotek: Nimam dostopa do DELAVCI.txt, ki ga navodila omenjajo, zato spodaj podajam tipične primere umazanih podatkov, značilne za stare namizne sisteme — preveri jih ob dejanski datoteki in po potrebi zamenjaj s konkretnimi primeri, ki jih dejansko najdeš.</w:t>
       </w:r>
     </w:p>
     <w:p>
@@ -15895,21 +15451,6 @@
       <w:r>
         <w:rPr>
           <w:rFonts w:ascii="Times New Roman" w:hAnsi="Times New Roman"/>
-          <w:b w:val="0"/>
-          <w:i w:val="0"/>
-          <w:sz w:val="24"/>
-        </w:rPr>
-        <w:t>&lt;!-- TVOJA RAZLAGA LOČENIH FAZE ETL: --&gt;</w:t>
-      </w:r>
-    </w:p>
-    <w:p>
-      <w:pPr>
-        <w:spacing w:before="0" w:after="120" w:lineRule="auto" w:line="360"/>
-        <w:jc w:val="both"/>
-      </w:pPr>
-      <w:r>
-        <w:rPr>
-          <w:rFonts w:ascii="Times New Roman" w:hAnsi="Times New Roman"/>
           <w:b/>
           <w:i w:val="0"/>
           <w:sz w:val="24"/>
@@ -16078,21 +15619,6 @@
           <w:i w:val="0"/>
           <w:sz w:val="24"/>
         </w:rPr>
-        <w:t>&lt;!-- TVOJA RAZLAGA TESTNIH OKOLIJ: --&gt;</w:t>
-      </w:r>
-    </w:p>
-    <w:p>
-      <w:pPr>
-        <w:spacing w:before="0" w:after="120" w:lineRule="auto" w:line="360"/>
-        <w:jc w:val="both"/>
-      </w:pPr>
-      <w:r>
-        <w:rPr>
-          <w:rFonts w:ascii="Times New Roman" w:hAnsi="Times New Roman"/>
-          <w:b w:val="0"/>
-          <w:i w:val="0"/>
-          <w:sz w:val="24"/>
-        </w:rPr>
         <w:t>Osnutek razlage testnih okolij:</w:t>
       </w:r>
     </w:p>
@@ -16196,21 +15722,6 @@
       <w:r>
         <w:rPr>
           <w:rFonts w:ascii="Times New Roman" w:hAnsi="Times New Roman"/>
-          <w:b w:val="0"/>
-          <w:i w:val="0"/>
-          <w:sz w:val="24"/>
-        </w:rPr>
-        <w:t>&lt;!-- TVOJA STRATEGIJA TESTIRANJA: --&gt;</w:t>
-      </w:r>
-    </w:p>
-    <w:p>
-      <w:pPr>
-        <w:spacing w:before="0" w:after="120" w:lineRule="auto" w:line="360"/>
-        <w:jc w:val="both"/>
-      </w:pPr>
-      <w:r>
-        <w:rPr>
-          <w:rFonts w:ascii="Times New Roman" w:hAnsi="Times New Roman"/>
           <w:b/>
           <w:i w:val="0"/>
           <w:sz w:val="24"/>
@@ -16307,21 +15818,6 @@
           <w:i w:val="0"/>
           <w:sz w:val="24"/>
         </w:rPr>
-        <w:t>&lt;!-- TVOJA RAZLAGA STATISTIČNEGA POKRITJA TESTOV: --&gt;</w:t>
-      </w:r>
-    </w:p>
-    <w:p>
-      <w:pPr>
-        <w:spacing w:before="0" w:after="120" w:lineRule="auto" w:line="360"/>
-        <w:jc w:val="both"/>
-      </w:pPr>
-      <w:r>
-        <w:rPr>
-          <w:rFonts w:ascii="Times New Roman" w:hAnsi="Times New Roman"/>
-          <w:b w:val="0"/>
-          <w:i w:val="0"/>
-          <w:sz w:val="24"/>
-        </w:rPr>
         <w:t>Testiranje na 1.000 realnih bruto vrednostih je bolj prepričljivo, ker realni podatki zajamejo širok razpon robnih primerov (zelo nizke plače, zelo visoke plače, vrednosti tik ob mejah davčnih razredov), ki jih pri ročnem izmišljanju petih primerov zlahka spregledamo. Večji nabor testnih primerov tako poveča verjetnost, da bomo odkrili redke, a resnične napake v logiki obračuna, še preden pridejo v produkcijo in vplivajo na dejanske plače zaposlenih.</w:t>
       </w:r>
     </w:p>
@@ -16477,15 +15973,6 @@
           <w:i w:val="0"/>
           <w:sz w:val="24"/>
         </w:rPr>
-        <w:t xml:space="preserve">&lt;!-- TVOJA UTEMELJITEV H1: --&gt; </w:t>
-      </w:r>
-      <w:r>
-        <w:rPr>
-          <w:rFonts w:ascii="Times New Roman" w:hAnsi="Times New Roman"/>
-          <w:b/>
-          <w:i w:val="0"/>
-          <w:sz w:val="24"/>
-        </w:rPr>
         <w:t>Osnutek utemeljitve H1:</w:t>
       </w:r>
     </w:p>
@@ -16581,15 +16068,6 @@
           <w:i w:val="0"/>
           <w:sz w:val="24"/>
         </w:rPr>
-        <w:t xml:space="preserve">&lt;!-- TVOJA MERITEV ZA H1: --&gt; </w:t>
-      </w:r>
-      <w:r>
-        <w:rPr>
-          <w:rFonts w:ascii="Times New Roman" w:hAnsi="Times New Roman"/>
-          <w:b/>
-          <w:i w:val="0"/>
-          <w:sz w:val="24"/>
-        </w:rPr>
         <w:t>Osnutek meritve za H1:</w:t>
       </w:r>
     </w:p>
@@ -16803,21 +16281,6 @@
           <w:i w:val="0"/>
           <w:sz w:val="24"/>
         </w:rPr>
-        <w:t>&lt;!-- TVOJA REFLEKSIJA O MEJAH VALIDACIJE: --&gt;</w:t>
-      </w:r>
-    </w:p>
-    <w:p>
-      <w:pPr>
-        <w:spacing w:before="0" w:after="120" w:lineRule="auto" w:line="360"/>
-        <w:jc w:val="both"/>
-      </w:pPr>
-      <w:r>
-        <w:rPr>
-          <w:rFonts w:ascii="Times New Roman" w:hAnsi="Times New Roman"/>
-          <w:b w:val="0"/>
-          <w:i w:val="0"/>
-          <w:sz w:val="24"/>
-        </w:rPr>
         <w:t>Osnutek refleksije o mejah validacije:</w:t>
       </w:r>
     </w:p>
@@ -16945,21 +16408,6 @@
       <w:r>
         <w:rPr>
           <w:rFonts w:ascii="Times New Roman" w:hAnsi="Times New Roman"/>
-          <w:b w:val="0"/>
-          <w:i w:val="0"/>
-          <w:sz w:val="24"/>
-        </w:rPr>
-        <w:t>&lt;!-- TVOJ TESTNI SCENARIJ ZA H3: --&gt;</w:t>
-      </w:r>
-    </w:p>
-    <w:p>
-      <w:pPr>
-        <w:spacing w:before="0" w:after="120" w:lineRule="auto" w:line="360"/>
-        <w:jc w:val="both"/>
-      </w:pPr>
-      <w:r>
-        <w:rPr>
-          <w:rFonts w:ascii="Times New Roman" w:hAnsi="Times New Roman"/>
           <w:b/>
           <w:i w:val="0"/>
           <w:sz w:val="24"/>
@@ -17181,21 +16629,6 @@
       <w:r>
         <w:rPr>
           <w:rFonts w:ascii="Times New Roman" w:hAnsi="Times New Roman"/>
-          <w:b w:val="0"/>
-          <w:i w:val="0"/>
-          <w:sz w:val="24"/>
-        </w:rPr>
-        <w:t>&lt;!-- TVOJA REFLEKSIJA O MEJAH RLS: --&gt;</w:t>
-      </w:r>
-    </w:p>
-    <w:p>
-      <w:pPr>
-        <w:spacing w:before="0" w:after="120" w:lineRule="auto" w:line="360"/>
-        <w:jc w:val="both"/>
-      </w:pPr>
-      <w:r>
-        <w:rPr>
-          <w:rFonts w:ascii="Times New Roman" w:hAnsi="Times New Roman"/>
           <w:b/>
           <w:i w:val="0"/>
           <w:sz w:val="24"/>
@@ -17390,21 +16823,6 @@
     </w:p>
     <w:p>
       <w:pPr>
-        <w:spacing w:before="0" w:after="120" w:lineRule="auto" w:line="360"/>
-        <w:jc w:val="both"/>
-      </w:pPr>
-      <w:r>
-        <w:rPr>
-          <w:rFonts w:ascii="Times New Roman" w:hAnsi="Times New Roman"/>
-          <w:b w:val="0"/>
-          <w:i w:val="0"/>
-          <w:sz w:val="24"/>
-        </w:rPr>
-        <w:t>&lt;!-- TVOJ LASTEN POVZETEK: --&gt;</w:t>
-      </w:r>
-    </w:p>
-    <w:p>
-      <w:pPr>
         <w:spacing w:before="200" w:after="80" w:lineRule="auto" w:line="288"/>
         <w:jc w:val="left"/>
       </w:pPr>
@@ -17464,21 +16882,6 @@
     </w:p>
     <w:p>
       <w:pPr>
-        <w:spacing w:before="0" w:after="120" w:lineRule="auto" w:line="360"/>
-        <w:jc w:val="both"/>
-      </w:pPr>
-      <w:r>
-        <w:rPr>
-          <w:rFonts w:ascii="Times New Roman" w:hAnsi="Times New Roman"/>
-          <w:b w:val="0"/>
-          <w:i w:val="0"/>
-          <w:sz w:val="24"/>
-        </w:rPr>
-        <w:t>&lt;!-- TVOJE SMERNICE ZA RAZVOJ: --&gt;</w:t>
-      </w:r>
-    </w:p>
-    <w:p>
-      <w:pPr>
         <w:spacing w:before="80" w:after="80" w:lineRule="auto" w:line="360"/>
         <w:ind w:left="567" w:right="567"/>
         <w:jc w:val="left"/>
@@ -17508,21 +16911,6 @@
     </w:p>
     <w:p>
       <w:pPr>
-        <w:spacing w:before="0" w:after="120" w:lineRule="auto" w:line="360"/>
-        <w:jc w:val="both"/>
-      </w:pPr>
-      <w:r>
-        <w:rPr>
-          <w:rFonts w:ascii="Times New Roman" w:hAnsi="Times New Roman"/>
-          <w:b w:val="0"/>
-          <w:i w:val="0"/>
-          <w:sz w:val="24"/>
-        </w:rPr>
-        <w:t>&lt;!-- TVOJA OSEBNA REFLEKSIJA: --&gt;</w:t>
-      </w:r>
-    </w:p>
-    <w:p>
-      <w:pPr>
         <w:spacing w:before="80" w:after="80" w:lineRule="auto" w:line="360"/>
         <w:ind w:left="567" w:right="567"/>
         <w:jc w:val="left"/>
@@ -17548,21 +16936,6 @@
           <w:sz w:val="22"/>
         </w:rPr>
         <w:t xml:space="preserve"> Katera arhitekturna odločitev bi bila danes drugačna, ko veš to, kar veš? (2–3 stavki — pokaže kritično razmišljanje)</w:t>
-      </w:r>
-    </w:p>
-    <w:p>
-      <w:pPr>
-        <w:spacing w:before="0" w:after="120" w:lineRule="auto" w:line="360"/>
-        <w:jc w:val="both"/>
-      </w:pPr>
-      <w:r>
-        <w:rPr>
-          <w:rFonts w:ascii="Times New Roman" w:hAnsi="Times New Roman"/>
-          <w:b w:val="0"/>
-          <w:i w:val="0"/>
-          <w:sz w:val="24"/>
-        </w:rPr>
-        <w:t>&lt;!-- TVOJA KRITIČNA REFLEKSIJA: --&gt;</w:t>
       </w:r>
     </w:p>
     <w:p>
@@ -18489,21 +17862,6 @@
     <w:p/>
     <w:p>
       <w:pPr>
-        <w:spacing w:before="0" w:after="120" w:lineRule="auto" w:line="360"/>
-        <w:jc w:val="both"/>
-      </w:pPr>
-      <w:r>
-        <w:rPr>
-          <w:rFonts w:ascii="Times New Roman" w:hAnsi="Times New Roman"/>
-          <w:b w:val="0"/>
-          <w:i w:val="0"/>
-          <w:sz w:val="24"/>
-        </w:rPr>
-        <w:t>&lt;!-- TVOJA TABELA PROBLEMATIČNIH STOLPCEV: --&gt;</w:t>
-      </w:r>
-    </w:p>
-    <w:p>
-      <w:pPr>
         <w:spacing w:before="200" w:after="80" w:lineRule="auto" w:line="288"/>
         <w:jc w:val="left"/>
       </w:pPr>
@@ -18548,21 +17906,6 @@
     </w:p>
     <w:p>
       <w:pPr>
-        <w:spacing w:before="0" w:after="120" w:lineRule="auto" w:line="360"/>
-        <w:jc w:val="both"/>
-      </w:pPr>
-      <w:r>
-        <w:rPr>
-          <w:rFonts w:ascii="Times New Roman" w:hAnsi="Times New Roman"/>
-          <w:b w:val="0"/>
-          <w:i w:val="0"/>
-          <w:sz w:val="24"/>
-        </w:rPr>
-        <w:t>&lt;!-- TVOJ PRIMER IZRAČUNA: --&gt;</w:t>
-      </w:r>
-    </w:p>
-    <w:p>
-      <w:pPr>
         <w:spacing w:before="200" w:after="80" w:lineRule="auto" w:line="288"/>
         <w:jc w:val="left"/>
       </w:pPr>
@@ -18603,21 +17946,6 @@
           <w:sz w:val="22"/>
         </w:rPr>
         <w:t xml:space="preserve"> Z besedami opiši arhitekturni diagram sistema (Angular ↔ Express ↔ MS SQL + Redis). Zapiši, katere komponente komunicirajo med seboj in prek katerih protokolov (HTTP, TCP, SQL). To bo osnova za diagram v Word dokumentu.</w:t>
-      </w:r>
-    </w:p>
-    <w:p>
-      <w:pPr>
-        <w:spacing w:before="0" w:after="120" w:lineRule="auto" w:line="360"/>
-        <w:jc w:val="both"/>
-      </w:pPr>
-      <w:r>
-        <w:rPr>
-          <w:rFonts w:ascii="Times New Roman" w:hAnsi="Times New Roman"/>
-          <w:b w:val="0"/>
-          <w:i w:val="0"/>
-          <w:sz w:val="24"/>
-        </w:rPr>
-        <w:t>&lt;!-- TVOJ OPIS ARHITEKTURE ZA DIAGRAM: --&gt;</w:t>
       </w:r>
     </w:p>
     <w:sectPr>

</xml_diff>